<commit_message>
docs: plain language review complete for chapter 7
</commit_message>
<xml_diff>
--- a/docs/thesis-chapter-7.docx
+++ b/docs/thesis-chapter-7.docx
@@ -62,7 +62,7 @@
           <w:i w:val="0"/>
           <w:sz w:val="24"/>
         </w:rPr>
-        <w:t>The Archon project delivers an AI-powered enterprise retrieval and question-answering system that grounds responses in document context. Its Retrieval-Augmented Generation (RAG) pipeline combines query expansion, vector retrieval, and LLM generation, while the multi-tenant organization model enforces role-based access control (RBAC) and scoped data isolation. The full-stack application is deployed with a React frontend, an Express API, and data services on MongoDB and ChromaDB to provide a practical, accessible interface for enterprise users.</w:t>
+        <w:t>The Archon project delivers an AI-powered enterprise retrieval and question-answering system that grounds responses in document context. Its Retrieval-Augmented Generation (RAG) pipeline combines query expansion, semantic search, and AI-generated responses, while the multi-tenant organization model enforces role-based access control (RBAC) and data isolation per organization. The full-stack application is deployed with a React frontend, an Express API, and data services on MongoDB and ChromaDB to provide a practical, accessible interface for enterprise users.</w:t>
       </w:r>
     </w:p>
     <w:p>
@@ -139,7 +139,7 @@
           <w:i w:val="0"/>
           <w:sz w:val="24"/>
         </w:rPr>
-        <w:t>Streaming responses using Server-Sent Events (SSE) or WebSocket transport would allow tokens to appear progressively, reducing perceived latency for end users. This change would also enable better handling of long responses and improve the interactive feel of the chat experience.</w:t>
+        <w:t>Streaming responses using a protocol such as Server-Sent Events (SSE) would allow words to appear as they are generated, reducing perceived latency for end users. This change would also enable better handling of long responses and improve the interactive feel of the chat experience.</w:t>
       </w:r>
     </w:p>
     <w:p>
@@ -201,7 +201,7 @@
           <w:i w:val="0"/>
           <w:sz w:val="24"/>
         </w:rPr>
-        <w:t>Integrating an OCR layer such as Tesseract or Google Document AI would extract text from scanned PDFs and image-embedded content. This enhancement would expand retrieval coverage to non-text documents that currently bypass the embedding pipeline.</w:t>
+        <w:t>Integrating an OCR layer such as Tesseract or Google Document AI would extract text from scanned PDFs and image-embedded content. This enhancement would expand retrieval coverage to non-text documents that are not currently indexed for search.</w:t>
       </w:r>
     </w:p>
     <w:p>
@@ -232,7 +232,7 @@
           <w:i w:val="0"/>
           <w:sz w:val="24"/>
         </w:rPr>
-        <w:t>A testing stack with Jest for unit tests and Supertest for API integration tests would improve regression detection and reduce risk during refactoring. Automated coverage would also support faster iteration with higher confidence in stability.</w:t>
+        <w:t>A dedicated testing suite covering individual components and API endpoints would improve the ability to catch unintended breakages and reduce risk during refactoring. Automated coverage would also support faster iteration with higher confidence in stability.</w:t>
       </w:r>
     </w:p>
     <w:p>
@@ -263,7 +263,7 @@
           <w:i w:val="0"/>
           <w:sz w:val="24"/>
         </w:rPr>
-        <w:t>Introducing a cross-encoder reranking step after initial vector retrieval would improve the ordering of candidate chunks before context injection. This refinement would increase answer precision, especially for dense or overlapping documents.</w:t>
+        <w:t>Introducing a reranking step using a secondary scoring model after the initial search would improve the ordering of retrieved sections before they are passed to the AI. This refinement would increase answer precision, especially for documents with similar or overlapping content.</w:t>
       </w:r>
     </w:p>
     <w:sectPr>

</xml_diff>